<commit_message>
Update proposal for three-person team
</commit_message>
<xml_diff>
--- a/01_提案/Project_Proposal_Qingcheng_Yu.docx
+++ b/01_提案/Project_Proposal_Qingcheng_Yu.docx
@@ -35,7 +35,9 @@
         <w:jc w:val="center"/>
       </w:pPr>
       <w:r>
-        <w:t>Qingcheng Yu   Fall 2026</w:t>
+        <w:t>Qingcheng Yu · Siu Kwun Yeung · Qingyin Guo</w:t>
+        <w:br/>
+        <w:t>Fall 2026</w:t>
       </w:r>
     </w:p>
     <w:p/>
@@ -46,67 +48,7 @@
         <w:jc w:val="both"/>
       </w:pPr>
       <w:r>
-        <w:rPr>
-          <w:rFonts w:ascii="Aptos" w:hAnsi="Aptos"/>
-          <w:i w:val="0"/>
-          <w:color w:val="000000"/>
-          <w:sz w:val="23"/>
-        </w:rPr>
-        <w:t xml:space="preserve">Tool-using agents can automate AI-platform operations, but an incorrect write action, such as reclaiming a running workload or changing a GPU quota, may interrupt training, violate ownership constraints, or affect a production service. I will study whether a context-aware intervention gate can decide when an agent should execute autonomously, request user confirmation, or hand the task to a platform operator before a state-changing tool call. Building on </w:t>
-      </w:r>
-      <w:r>
-        <w:rPr>
-          <w:rFonts w:ascii="Aptos" w:hAnsi="Aptos"/>
-          <w:i/>
-          <w:color w:val="000000"/>
-          <w:sz w:val="23"/>
-        </w:rPr>
-        <w:t>τ-bench</w:t>
-      </w:r>
-      <w:r>
-        <w:rPr>
-          <w:rFonts w:ascii="Aptos" w:hAnsi="Aptos"/>
-          <w:i w:val="0"/>
-          <w:color w:val="000000"/>
-          <w:sz w:val="23"/>
-        </w:rPr>
-        <w:t xml:space="preserve"> and </w:t>
-      </w:r>
-      <w:r>
-        <w:rPr>
-          <w:rFonts w:ascii="Aptos" w:hAnsi="Aptos"/>
-          <w:i/>
-          <w:color w:val="000000"/>
-          <w:sz w:val="23"/>
-        </w:rPr>
-        <w:t>ToolSandbox</w:t>
-      </w:r>
-      <w:r>
-        <w:rPr>
-          <w:rFonts w:ascii="Aptos" w:hAnsi="Aptos"/>
-          <w:i w:val="0"/>
-          <w:color w:val="000000"/>
-          <w:sz w:val="23"/>
-        </w:rPr>
-        <w:t xml:space="preserve"> as evaluation references and on </w:t>
-      </w:r>
-      <w:r>
-        <w:rPr>
-          <w:rFonts w:ascii="Aptos" w:hAnsi="Aptos"/>
-          <w:i/>
-          <w:color w:val="000000"/>
-          <w:sz w:val="23"/>
-        </w:rPr>
-        <w:t>SABER</w:t>
-      </w:r>
-      <w:r>
-        <w:rPr>
-          <w:rFonts w:ascii="Aptos" w:hAnsi="Aptos"/>
-          <w:i w:val="0"/>
-          <w:color w:val="000000"/>
-          <w:sz w:val="23"/>
-        </w:rPr>
-        <w:t>'s mutation-gated verification, I will implement a lightweight Python simulator rather than a full Kubernetes deployment. The dataset will contain 20-30 base scenarios, each with three matched context variants, yielding 60-90 synthetic cases across four operation families: GPU-quota adjustment, workload preemption or reclamation, resource transfer, and model rollout or rollback. Within each matched group, the proposed tool remains similar while resource ownership, current workload state, reversibility, checkpoint availability, authorization, and blast radius change the appropriate intervention. A deterministic policy and state-transition oracle will provide labels and score the resulting system state; variants derived from the same base scenario will remain in the same data split to prevent leakage. For each proposed mutation, the method will collect relevant state evidence, enforce explicit hard constraints, and use a policy-grounded language-model critic to route each remaining action to Execute, Confirm, or Handoff. I will compare it with ungated execution, verification of every mutation, a static tool-risk policy, and a lightweight binary approximation of SABER's mutation-gated verifier. Evaluation will report unsafe mutation rate, authorized task completion, autonomous coverage, confirmation and handoff burden, and latency and token cost, a safety-coverage plot, together with qualitative analysis of representative failures. Confirmation and handoff will be counted as interventions rather than automatic successes. This controlled application study will test whether three-way, context-sensitive intervention offers a better safety and autonomy trade-off than simpler gates, without claiming that synthetic results establish production safety.</w:t>
+        <w:t>Tool-using agents can automate consequential operations, but an incorrect write action may interrupt a service, cross an ownership boundary, or create an unrecoverable state. We will study whether a context-aware intervention gate can decide when an agent should Execute, request Confirmation, or Handoff to a human before a state-changing tool call. We will draw on τ-bench and ToolSandbox for stateful evaluation, SABER for mutation-gated verification, and semantic-entropy work for disagreement-based uncertainty. Our controlled dataset will contain 40 base scenarios with three matched context variants each (120 cases) across GPU quota changes, workload preemption, resource transfer, model rollout, and capacity reclamation. Within each family, the proposed operation remains similar while approval evidence, ownership, production status, reversibility, recovery paths, and blast radius change. A deterministic simulator and state-transition oracle will label harmful mutations independently of the routing decision; sibling variants will stay in one split. The method will first block malformed or strictly inadmissible actions, then aggregate repeated critic samples using mean risk, routing disagreement, reason-code agreement, and scoped-approval consistency. An interpretable calibrated classifier will estimate execution risk, with thresholds selected only on the development set to map eligible cases to Execute, Confirm, or Handoff. We will compare ungated execution, verify-every-mutation, static tool tiers, a single prompted critic, and an uncalibrated ensemble. Evaluation will report harmful-mutation rate, safe autonomous completion, coverage, selective risk, Brier score, risk–coverage curves, intervention burden, latency, and token cost, together with ablations and failure analysis. Our three-member team combines experience in agent product and evaluation, enterprise multi-agent workflows and controls, and startup agent implementation; these strengths support benchmark design, runtime integration, and reproducible experimentation. The study will test whether calibrated three-way intervention improves the safety–autonomy trade-off without treating synthetic results as production guarantees.</w:t>
       </w:r>
     </w:p>
     <w:sectPr>

</xml_diff>